<commit_message>
add a few features
</commit_message>
<xml_diff>
--- a/templates/TB.docx
+++ b/templates/TB.docx
@@ -6674,15 +6674,6 @@
           <w:lang w:val="vi-VN"/>
         </w:rPr>
       </w:pPr>
-      <w:r>
-        <w:rPr>
-          <w:rFonts w:ascii="Times New Roman" w:hAnsi="Times New Roman"/>
-          <w:bCs/>
-          <w:sz w:val="28"/>
-          <w:szCs w:val="28"/>
-        </w:rPr>
-        <w:t>+</w:t>
-      </w:r>
       <w:r>
         <w:rPr>
           <w:rFonts w:ascii="Times New Roman" w:hAnsi="Times New Roman"/>
@@ -10756,7 +10747,37 @@
                 <w:sz w:val="28"/>
                 <w:szCs w:val="28"/>
               </w:rPr>
-              <w:t>{{product.vendor}}</w:t>
+              <w:t>{{product</w:t>
+            </w:r>
+            <w:r>
+              <w:rPr>
+                <w:rFonts w:ascii="Times New Roman" w:hAnsi="Times New Roman"/>
+                <w:bCs/>
+                <w:color w:val="000000"/>
+                <w:sz w:val="28"/>
+                <w:szCs w:val="28"/>
+              </w:rPr>
+              <w:t>.</w:t>
+            </w:r>
+            <w:r>
+              <w:rPr>
+                <w:rFonts w:ascii="Times New Roman" w:hAnsi="Times New Roman"/>
+                <w:bCs/>
+                <w:color w:val="000000"/>
+                <w:sz w:val="28"/>
+                <w:szCs w:val="28"/>
+              </w:rPr>
+              <w:t>brand</w:t>
+            </w:r>
+            <w:r>
+              <w:rPr>
+                <w:rFonts w:ascii="Times New Roman" w:hAnsi="Times New Roman"/>
+                <w:bCs/>
+                <w:color w:val="000000"/>
+                <w:sz w:val="28"/>
+                <w:szCs w:val="28"/>
+              </w:rPr>
+              <w:t>}}</w:t>
             </w:r>
           </w:p>
         </w:tc>
@@ -10788,15 +10809,17 @@
               <w:t>{{product.</w:t>
             </w:r>
             <w:r>
+              <w:t xml:space="preserve"> </w:t>
+            </w:r>
+            <w:r>
               <w:rPr>
                 <w:rFonts w:ascii="Times New Roman" w:hAnsi="Times New Roman"/>
                 <w:bCs/>
                 <w:color w:val="000000"/>
                 <w:sz w:val="28"/>
                 <w:szCs w:val="28"/>
-                <w:lang w:val="en"/>
-              </w:rPr>
-              <w:t>Guarantee</w:t>
+              </w:rPr>
+              <w:t>warranty</w:t>
             </w:r>
             <w:r>
               <w:rPr>

</xml_diff>